<commit_message>
11/6 Notebook muy completo de prediccion 4 semanas con muchos modelos después de reunión con Manuel y entrega Pripuesta TFN
</commit_message>
<xml_diff>
--- a/notas_tfm.docx
+++ b/notas_tfm.docx
@@ -123,73 +123,63 @@
         <w:rPr>
           <w:rFonts w:ascii="Times New Roman" w:hAnsi="Times New Roman" w:cs="Times New Roman"/>
         </w:rPr>
-        <w:t xml:space="preserve">Este trabajo presenta un sistema de predicción de variantes emergentes de SARS-CoV-2 que integra dos fuentes de información complementarias: la vigilancia genómica global (17,5 millones de secuencias de GISAID) y datos de Ultra-Deep </w:t>
-      </w:r>
-      <w:proofErr w:type="spellStart"/>
-      <w:r>
-        <w:rPr>
-          <w:rFonts w:ascii="Times New Roman" w:hAnsi="Times New Roman" w:cs="Times New Roman"/>
-        </w:rPr>
-        <w:t>Sequencing</w:t>
-      </w:r>
-      <w:proofErr w:type="spellEnd"/>
-      <w:r>
-        <w:rPr>
-          <w:rFonts w:ascii="Times New Roman" w:hAnsi="Times New Roman" w:cs="Times New Roman"/>
-        </w:rPr>
-        <w:t xml:space="preserve"> (UDS) de 28 pacientes con infección activa. El sistema transforma estos datos en 94 variables numéricas que describen la trayectoria dinámica de cada variante viral </w:t>
-      </w:r>
-      <w:r>
-        <w:rPr>
-          <w:rFonts w:ascii="Times New Roman" w:hAnsi="Times New Roman" w:cs="Times New Roman"/>
-        </w:rPr>
-        <w:t>(</w:t>
-      </w:r>
-      <w:r>
-        <w:rPr>
-          <w:rFonts w:ascii="Times New Roman" w:hAnsi="Times New Roman" w:cs="Times New Roman"/>
-        </w:rPr>
-        <w:t>frecuencia, velocidad de crecimiento, dispersión geográfica y composición mutacional</w:t>
-      </w:r>
-      <w:r>
-        <w:rPr>
-          <w:rFonts w:ascii="Times New Roman" w:hAnsi="Times New Roman" w:cs="Times New Roman"/>
-        </w:rPr>
-        <w:t>)</w:t>
-      </w:r>
-      <w:r>
-        <w:rPr>
-          <w:rFonts w:ascii="Times New Roman" w:hAnsi="Times New Roman" w:cs="Times New Roman"/>
-        </w:rPr>
-        <w:t xml:space="preserve"> y entrena un modelo de machine </w:t>
-      </w:r>
-      <w:proofErr w:type="spellStart"/>
-      <w:r>
-        <w:rPr>
-          <w:rFonts w:ascii="Times New Roman" w:hAnsi="Times New Roman" w:cs="Times New Roman"/>
-        </w:rPr>
-        <w:t>learning</w:t>
-      </w:r>
-      <w:proofErr w:type="spellEnd"/>
-      <w:r>
-        <w:rPr>
-          <w:rFonts w:ascii="Times New Roman" w:hAnsi="Times New Roman" w:cs="Times New Roman"/>
-        </w:rPr>
-        <w:t xml:space="preserve"> (</w:t>
-      </w:r>
-      <w:proofErr w:type="spellStart"/>
-      <w:r>
-        <w:rPr>
-          <w:rFonts w:ascii="Times New Roman" w:hAnsi="Times New Roman" w:cs="Times New Roman"/>
-        </w:rPr>
-        <w:t>LightGBM</w:t>
-      </w:r>
-      <w:proofErr w:type="spellEnd"/>
-      <w:r>
-        <w:rPr>
-          <w:rFonts w:ascii="Times New Roman" w:hAnsi="Times New Roman" w:cs="Times New Roman"/>
-        </w:rPr>
-        <w:t>) para predecir qué clados expandirán su frecuencia en la semana siguiente.</w:t>
+        <w:t>Este trabajo presenta un sistema de predicción de variantes emergentes de SARS-CoV-2 basado en machine learning que procesa 17,15 millones de secuencias genómicas de GISAID (diciembre 2019 – febrero 2026). Se desarrollan dos modelos complementarios: el Modelo 1 opera sobre 19 grupos Nextclade (19A–25C) con 13 features temporales, y el Modelo 2 opera sobre 366 familias Pango (XFG, JN, BA...) añadiendo 30 features mutacionales calculadas como el perfil mutacional interno de cada familia (fracción de sus secuencias que portan cada mutación esa semana). Ambos modelos predicen si un linaje crecerá ≥50% y superará el 0,5% de frecuencia global en las siguientes 4 semanas.</w:t>
+      </w:r>
+      <w:proofErr w:type="spellStart"/>
+      <w:r>
+        <w:rPr>
+          <w:rFonts w:ascii="Times New Roman" w:hAnsi="Times New Roman" w:cs="Times New Roman"/>
+        </w:rPr>
+      </w:r>
+      <w:proofErr w:type="spellEnd"/>
+      <w:r>
+        <w:rPr>
+          <w:rFonts w:ascii="Times New Roman" w:hAnsi="Times New Roman" w:cs="Times New Roman"/>
+        </w:rPr>
+      </w:r>
+      <w:r>
+        <w:rPr>
+          <w:rFonts w:ascii="Times New Roman" w:hAnsi="Times New Roman" w:cs="Times New Roman"/>
+        </w:rPr>
+      </w:r>
+      <w:r>
+        <w:rPr>
+          <w:rFonts w:ascii="Times New Roman" w:hAnsi="Times New Roman" w:cs="Times New Roman"/>
+        </w:rPr>
+      </w:r>
+      <w:r>
+        <w:rPr>
+          <w:rFonts w:ascii="Times New Roman" w:hAnsi="Times New Roman" w:cs="Times New Roman"/>
+        </w:rPr>
+      </w:r>
+      <w:r>
+        <w:rPr>
+          <w:rFonts w:ascii="Times New Roman" w:hAnsi="Times New Roman" w:cs="Times New Roman"/>
+        </w:rPr>
+      </w:r>
+      <w:proofErr w:type="spellStart"/>
+      <w:r>
+        <w:rPr>
+          <w:rFonts w:ascii="Times New Roman" w:hAnsi="Times New Roman" w:cs="Times New Roman"/>
+        </w:rPr>
+      </w:r>
+      <w:proofErr w:type="spellEnd"/>
+      <w:r>
+        <w:rPr>
+          <w:rFonts w:ascii="Times New Roman" w:hAnsi="Times New Roman" w:cs="Times New Roman"/>
+        </w:rPr>
+      </w:r>
+      <w:proofErr w:type="spellStart"/>
+      <w:r>
+        <w:rPr>
+          <w:rFonts w:ascii="Times New Roman" w:hAnsi="Times New Roman" w:cs="Times New Roman"/>
+        </w:rPr>
+      </w:r>
+      <w:proofErr w:type="spellEnd"/>
+      <w:r>
+        <w:rPr>
+          <w:rFonts w:ascii="Times New Roman" w:hAnsi="Times New Roman" w:cs="Times New Roman"/>
+        </w:rPr>
       </w:r>
     </w:p>
     <w:p>
@@ -203,7 +193,7 @@
         <w:rPr>
           <w:rFonts w:ascii="Times New Roman" w:hAnsi="Times New Roman" w:cs="Times New Roman"/>
         </w:rPr>
-        <w:t>El modelo alcanza un AUC de 0,82 en datos completamente fuera del período de entrenamiento, con validación walk-forward a través de las cuatro transiciones pandémicas principales (pre-VOC→Delta, Delta→Omicron BA.1, Omicron BA.1→BA.4/5+, BA.4/5+→Post-2023). El análisis retrospectivo de los haplotipos discordantes de los 28 pacientes UDS muestra que el espacio mutacional intrapaciente se solapó con el espacio evolutivo poblacional del virus: los clados detectados como minoría en los pacientes emergieron globalmente con un lead-time de hasta 50 semanas, lo que es coherente con la teoría de cuasiespecies. La validación prospectiva real (febrero–abril 2026) confirma que el sistema identifica correctamente las familias virales dominantes: XFG* (70% de frecuencia global) y XDV* (16,4%) estaban representadas en el top-15 del ranking.</w:t>
+        <w:t>El Modelo 1 alcanza un AUC de 0,8398 (baseline aleatorio: 0,498) usando exclusivamente features de dinámica temporal. El Modelo 2, con features mutacionales within-family, alcanza AUC = 0,8391, prácticamente idéntico al Modelo 1, demostrando que el perfil mutacional real del linaje añade información (+0,009 AUC sobre el modelo solo-temporal) cuando se calcula correctamente. Con threshold óptimo (0,157), el sistema alcanza F1 = 0,40, Precision = 0,38 y Recall = 0,43. El análisis SHAP confirma que las tres features más predictivas son freq_t0 (0,378), slope_8w (0,302) y slope_4w (0,268), validando que la dinámica de momentum es el predictor dominante.</w:t>
       </w:r>
       <w:proofErr w:type="spellStart"/>
       <w:r>
@@ -796,35 +786,31 @@
         <w:rPr>
           <w:rFonts w:ascii="Times New Roman" w:hAnsi="Times New Roman" w:cs="Times New Roman"/>
         </w:rPr>
-        <w:t xml:space="preserve">La fuente principal de datos son 17,5 millones de secuencias genómicas de SARS-CoV-2 depositadas en GISAID hasta febrero de 2026, correspondientes a las proteínas NSP12 (RNA polimerasa dependiente de RNA, ~17,5 millones de secuencias) y Spike (proteína de entrada al hospedador, ~16 millones de secuencias). Cada secuencia incluye metadatos asociados: </w:t>
-      </w:r>
-      <w:proofErr w:type="spellStart"/>
-      <w:r>
-        <w:rPr>
-          <w:rFonts w:ascii="Times New Roman" w:hAnsi="Times New Roman" w:cs="Times New Roman"/>
-        </w:rPr>
-        <w:t>clado</w:t>
-      </w:r>
-      <w:proofErr w:type="spellEnd"/>
-      <w:r>
-        <w:rPr>
-          <w:rFonts w:ascii="Times New Roman" w:hAnsi="Times New Roman" w:cs="Times New Roman"/>
-        </w:rPr>
-        <w:t xml:space="preserve"> </w:t>
-      </w:r>
-      <w:proofErr w:type="spellStart"/>
-      <w:r>
-        <w:rPr>
-          <w:rFonts w:ascii="Times New Roman" w:hAnsi="Times New Roman" w:cs="Times New Roman"/>
-        </w:rPr>
-        <w:t>Nextclade</w:t>
-      </w:r>
-      <w:proofErr w:type="spellEnd"/>
-      <w:r>
-        <w:rPr>
-          <w:rFonts w:ascii="Times New Roman" w:hAnsi="Times New Roman" w:cs="Times New Roman"/>
-        </w:rPr>
-        <w:t>, fecha de colección y país de origen.</w:t>
+        <w:t>La fuente principal de datos son 17,15 millones de secuencias genómicas de SARS-CoV-2 depositadas en GISAID hasta febrero de 2026 (322 semanas, diciembre 2019 – febrero 2026). De cada secuencia se extraen: fecha de colección, país de origen, clado Nextclade, linaje Pango y las sustituciones aminoacídicas respecto al genoma de referencia Wuhan (campo AA Substitutions). Los 17,15M de secuencias contienen 4.883 linajes Pango únicos que se agrupan en dos niveles de granularidad: (1) 19 grupos Nextclade con datos representativos (de los 51 clados nombrados 19A–25C) y (2) 448 familias Pango (prefijo raíz del nombre: XFG, JN, BA, KP...). El volumen de datos permite estimar frecuencias de circulación y perfiles mutacionales con resolución semanal y resolución geográfica de hasta 195 países.</w:t>
+      </w:r>
+      <w:proofErr w:type="spellStart"/>
+      <w:r>
+        <w:rPr>
+          <w:rFonts w:ascii="Times New Roman" w:hAnsi="Times New Roman" w:cs="Times New Roman"/>
+        </w:rPr>
+      </w:r>
+      <w:proofErr w:type="spellEnd"/>
+      <w:r>
+        <w:rPr>
+          <w:rFonts w:ascii="Times New Roman" w:hAnsi="Times New Roman" w:cs="Times New Roman"/>
+        </w:rPr>
+      </w:r>
+      <w:proofErr w:type="spellStart"/>
+      <w:r>
+        <w:rPr>
+          <w:rFonts w:ascii="Times New Roman" w:hAnsi="Times New Roman" w:cs="Times New Roman"/>
+        </w:rPr>
+      </w:r>
+      <w:proofErr w:type="spellEnd"/>
+      <w:r>
+        <w:rPr>
+          <w:rFonts w:ascii="Times New Roman" w:hAnsi="Times New Roman" w:cs="Times New Roman"/>
+        </w:rPr>
       </w:r>
     </w:p>
     <w:p>
@@ -1186,67 +1172,58 @@
         <w:rPr>
           <w:rFonts w:ascii="Times New Roman" w:hAnsi="Times New Roman" w:cs="Times New Roman"/>
         </w:rPr>
-        <w:t>La unidad de análisis del modelo es el par (</w:t>
-      </w:r>
-      <w:proofErr w:type="spellStart"/>
-      <w:r>
-        <w:rPr>
-          <w:rFonts w:ascii="Times New Roman" w:hAnsi="Times New Roman" w:cs="Times New Roman"/>
-        </w:rPr>
-        <w:t>clado</w:t>
-      </w:r>
-      <w:proofErr w:type="spellEnd"/>
-      <w:r>
-        <w:rPr>
-          <w:rFonts w:ascii="Times New Roman" w:hAnsi="Times New Roman" w:cs="Times New Roman"/>
-        </w:rPr>
-        <w:t xml:space="preserve">, semana): un </w:t>
-      </w:r>
-      <w:proofErr w:type="spellStart"/>
-      <w:r>
-        <w:rPr>
-          <w:rFonts w:ascii="Times New Roman" w:hAnsi="Times New Roman" w:cs="Times New Roman"/>
-        </w:rPr>
-        <w:t>clado</w:t>
-      </w:r>
-      <w:proofErr w:type="spellEnd"/>
-      <w:r>
-        <w:rPr>
-          <w:rFonts w:ascii="Times New Roman" w:hAnsi="Times New Roman" w:cs="Times New Roman"/>
-        </w:rPr>
-        <w:t xml:space="preserve"> concreto en una semana concreta. Para cada par, el modelo responde a una pregunta binaria: </w:t>
-      </w:r>
-      <w:r>
-        <w:rPr>
-          <w:rFonts w:ascii="Times New Roman" w:hAnsi="Times New Roman" w:cs="Times New Roman"/>
-        </w:rPr>
-        <w:t xml:space="preserve">¿crecerá este </w:t>
-      </w:r>
-      <w:proofErr w:type="spellStart"/>
-      <w:r>
-        <w:rPr>
-          <w:rFonts w:ascii="Times New Roman" w:hAnsi="Times New Roman" w:cs="Times New Roman"/>
-        </w:rPr>
-        <w:t>clado</w:t>
-      </w:r>
-      <w:proofErr w:type="spellEnd"/>
-      <w:r>
-        <w:rPr>
-          <w:rFonts w:ascii="Times New Roman" w:hAnsi="Times New Roman" w:cs="Times New Roman"/>
-        </w:rPr>
-        <w:t xml:space="preserve"> un 50% en términos relativos Y superará el 0.5% de frecuencia global en las próximas 4 semanas?</w:t>
-      </w:r>
-      <w:r>
-        <w:rPr>
-          <w:rFonts w:ascii="Times New Roman" w:hAnsi="Times New Roman" w:cs="Times New Roman"/>
-        </w:rPr>
-        <w:t xml:space="preserve"> </w:t>
-      </w:r>
-      <w:r>
-        <w:rPr>
-          <w:rFonts w:ascii="Times New Roman" w:hAnsi="Times New Roman" w:cs="Times New Roman"/>
-        </w:rPr>
-        <w:t>En total se construyen 69.363 observaciones, que abarcan desde febrero de 2020 hasta principios de 2026. De estas, 3.337 son positivas (4,8%), reflejando la realidad biológica de que en cualquier semana dada solo unos pocos clados están en expansión activa.</w:t>
+        <w:t>La unidad de análisis es el par (linaje, semana): un linaje concreto en una semana concreta. Para cada par, el modelo responde: ¿crecerá este linaje ≥50% en términos de frecuencia global Y superará el 0,5% de prevalencia en las próximas 4 semanas? El umbral del 0,5% evita predecir el crecimiento de linajes con 1-2 secuencias (ruido estadístico). El horizonte de 4 semanas y la ventana histórica de 8 semanas definen el espacio temporal del problema.</w:t>
+      </w:r>
+      <w:proofErr w:type="spellStart"/>
+      <w:r>
+        <w:rPr>
+          <w:rFonts w:ascii="Times New Roman" w:hAnsi="Times New Roman" w:cs="Times New Roman"/>
+        </w:rPr>
+      </w:r>
+      <w:proofErr w:type="spellEnd"/>
+      <w:r>
+        <w:rPr>
+          <w:rFonts w:ascii="Times New Roman" w:hAnsi="Times New Roman" w:cs="Times New Roman"/>
+        </w:rPr>
+      </w:r>
+      <w:proofErr w:type="spellStart"/>
+      <w:r>
+        <w:rPr>
+          <w:rFonts w:ascii="Times New Roman" w:hAnsi="Times New Roman" w:cs="Times New Roman"/>
+        </w:rPr>
+      </w:r>
+      <w:proofErr w:type="spellEnd"/>
+      <w:r>
+        <w:rPr>
+          <w:rFonts w:ascii="Times New Roman" w:hAnsi="Times New Roman" w:cs="Times New Roman"/>
+        </w:rPr>
+      </w:r>
+      <w:r>
+        <w:rPr>
+          <w:rFonts w:ascii="Times New Roman" w:hAnsi="Times New Roman" w:cs="Times New Roman"/>
+        </w:rPr>
+      </w:r>
+      <w:proofErr w:type="spellStart"/>
+      <w:r>
+        <w:rPr>
+          <w:rFonts w:ascii="Times New Roman" w:hAnsi="Times New Roman" w:cs="Times New Roman"/>
+        </w:rPr>
+      </w:r>
+      <w:proofErr w:type="spellEnd"/>
+      <w:r>
+        <w:rPr>
+          <w:rFonts w:ascii="Times New Roman" w:hAnsi="Times New Roman" w:cs="Times New Roman"/>
+        </w:rPr>
+      </w:r>
+      <w:r>
+        <w:rPr>
+          <w:rFonts w:ascii="Times New Roman" w:hAnsi="Times New Roman" w:cs="Times New Roman"/>
+        </w:rPr>
+      </w:r>
+      <w:r>
+        <w:rPr>
+          <w:rFonts w:ascii="Times New Roman" w:hAnsi="Times New Roman" w:cs="Times New Roman"/>
+        </w:rPr>
       </w:r>
     </w:p>
     <w:p>
@@ -1260,21 +1237,19 @@
         <w:rPr>
           <w:rFonts w:ascii="Times New Roman" w:hAnsi="Times New Roman" w:cs="Times New Roman"/>
         </w:rPr>
-        <w:t>Para cada par (</w:t>
-      </w:r>
-      <w:proofErr w:type="spellStart"/>
-      <w:r>
-        <w:rPr>
-          <w:rFonts w:ascii="Times New Roman" w:hAnsi="Times New Roman" w:cs="Times New Roman"/>
-        </w:rPr>
-        <w:t>clado</w:t>
-      </w:r>
-      <w:proofErr w:type="spellEnd"/>
-      <w:r>
-        <w:rPr>
-          <w:rFonts w:ascii="Times New Roman" w:hAnsi="Times New Roman" w:cs="Times New Roman"/>
-        </w:rPr>
-        <w:t>, semana) se calculan 94 variables de entrada, organizadas en tres grupos:</w:t>
+        <w:t>Se calculan dos conjuntos de features. El Modelo 1 usa 13 features temporales derivadas de la trayectoria de frecuencia en las últimas 8 semanas: frecuencias históricas (freq_t0, freq_4w_ago, freq_2w_ago, freq_mean_8w, freq_std_8w), tendencias (slope_8w, slope_4w, accel), contexto de actividad (n_active_8w, age_weeks, peak_hist) y diversidad geográfica (n_countries, geo_growth). El Modelo 2 extiende estas 13 con 2 features geográficas adicionales (entropia_geo, velocidad_expansion) y 30 features mutacionales: para cada mutación seleccionada, la fracción de secuencias de esa familia concreta que la portaban esa semana. Las 30 mutaciones se eligen por máxima varianza temporal en el periodo de entrenamiento (anti-leakage).</w:t>
+      </w:r>
+      <w:proofErr w:type="spellStart"/>
+      <w:r>
+        <w:rPr>
+          <w:rFonts w:ascii="Times New Roman" w:hAnsi="Times New Roman" w:cs="Times New Roman"/>
+        </w:rPr>
+      </w:r>
+      <w:proofErr w:type="spellEnd"/>
+      <w:r>
+        <w:rPr>
+          <w:rFonts w:ascii="Times New Roman" w:hAnsi="Times New Roman" w:cs="Times New Roman"/>
+        </w:rPr>
       </w:r>
     </w:p>
     <w:p>
@@ -2170,199 +2145,171 @@
         <w:rPr>
           <w:rFonts w:ascii="Times New Roman" w:hAnsi="Times New Roman" w:cs="Times New Roman"/>
         </w:rPr>
-        <w:t xml:space="preserve">Se entrenan y comparan tres modelos: (i) un </w:t>
-      </w:r>
-      <w:proofErr w:type="spellStart"/>
-      <w:r>
-        <w:rPr>
-          <w:rFonts w:ascii="Times New Roman" w:hAnsi="Times New Roman" w:cs="Times New Roman"/>
-        </w:rPr>
-        <w:t>baseline</w:t>
-      </w:r>
-      <w:proofErr w:type="spellEnd"/>
-      <w:r>
-        <w:rPr>
-          <w:rFonts w:ascii="Times New Roman" w:hAnsi="Times New Roman" w:cs="Times New Roman"/>
-        </w:rPr>
-        <w:t xml:space="preserve"> (</w:t>
-      </w:r>
-      <w:proofErr w:type="spellStart"/>
-      <w:r>
-        <w:rPr>
-          <w:rFonts w:ascii="Times New Roman" w:hAnsi="Times New Roman" w:cs="Times New Roman"/>
-        </w:rPr>
-        <w:t>DummyClassifier</w:t>
-      </w:r>
-      <w:proofErr w:type="spellEnd"/>
-      <w:r>
-        <w:rPr>
-          <w:rFonts w:ascii="Times New Roman" w:hAnsi="Times New Roman" w:cs="Times New Roman"/>
-        </w:rPr>
-        <w:t>) que predice aleatoriamente (AUC = 0,50)</w:t>
-      </w:r>
-      <w:r>
-        <w:rPr>
-          <w:rFonts w:ascii="Times New Roman" w:hAnsi="Times New Roman" w:cs="Times New Roman"/>
-        </w:rPr>
-        <w:t>,</w:t>
-      </w:r>
-      <w:r>
-        <w:rPr>
-          <w:rFonts w:ascii="Times New Roman" w:hAnsi="Times New Roman" w:cs="Times New Roman"/>
-        </w:rPr>
-        <w:t xml:space="preserve"> (</w:t>
-      </w:r>
-      <w:proofErr w:type="spellStart"/>
-      <w:r>
-        <w:rPr>
-          <w:rFonts w:ascii="Times New Roman" w:hAnsi="Times New Roman" w:cs="Times New Roman"/>
-        </w:rPr>
-        <w:t>ii</w:t>
-      </w:r>
-      <w:proofErr w:type="spellEnd"/>
-      <w:r>
-        <w:rPr>
-          <w:rFonts w:ascii="Times New Roman" w:hAnsi="Times New Roman" w:cs="Times New Roman"/>
-        </w:rPr>
-        <w:t xml:space="preserve">) </w:t>
-      </w:r>
-      <w:proofErr w:type="spellStart"/>
-      <w:r>
-        <w:rPr>
-          <w:rFonts w:ascii="Times New Roman" w:hAnsi="Times New Roman" w:cs="Times New Roman"/>
-        </w:rPr>
-        <w:t>m_base</w:t>
-      </w:r>
-      <w:proofErr w:type="spellEnd"/>
-      <w:r>
-        <w:rPr>
-          <w:rFonts w:ascii="Times New Roman" w:hAnsi="Times New Roman" w:cs="Times New Roman"/>
-        </w:rPr>
-        <w:t xml:space="preserve">, el modelo principal entrenado exclusivamente con </w:t>
-      </w:r>
-      <w:proofErr w:type="spellStart"/>
-      <w:r>
-        <w:rPr>
-          <w:rFonts w:ascii="Times New Roman" w:hAnsi="Times New Roman" w:cs="Times New Roman"/>
-        </w:rPr>
-        <w:t>features</w:t>
-      </w:r>
-      <w:proofErr w:type="spellEnd"/>
-      <w:r>
-        <w:rPr>
-          <w:rFonts w:ascii="Times New Roman" w:hAnsi="Times New Roman" w:cs="Times New Roman"/>
-        </w:rPr>
-        <w:t xml:space="preserve"> de GISAID</w:t>
-      </w:r>
-      <w:r>
-        <w:rPr>
-          <w:rFonts w:ascii="Times New Roman" w:hAnsi="Times New Roman" w:cs="Times New Roman"/>
-        </w:rPr>
-        <w:t>,</w:t>
-      </w:r>
-      <w:r>
-        <w:rPr>
-          <w:rFonts w:ascii="Times New Roman" w:hAnsi="Times New Roman" w:cs="Times New Roman"/>
-        </w:rPr>
-        <w:t xml:space="preserve"> y (</w:t>
-      </w:r>
-      <w:proofErr w:type="spellStart"/>
-      <w:r>
-        <w:rPr>
-          <w:rFonts w:ascii="Times New Roman" w:hAnsi="Times New Roman" w:cs="Times New Roman"/>
-        </w:rPr>
-        <w:t>iii</w:t>
-      </w:r>
-      <w:proofErr w:type="spellEnd"/>
-      <w:r>
-        <w:rPr>
-          <w:rFonts w:ascii="Times New Roman" w:hAnsi="Times New Roman" w:cs="Times New Roman"/>
-        </w:rPr>
-        <w:t xml:space="preserve">) </w:t>
-      </w:r>
-      <w:proofErr w:type="spellStart"/>
-      <w:r>
-        <w:rPr>
-          <w:rFonts w:ascii="Times New Roman" w:hAnsi="Times New Roman" w:cs="Times New Roman"/>
-        </w:rPr>
-        <w:t>m_ext</w:t>
-      </w:r>
-      <w:proofErr w:type="spellEnd"/>
-      <w:r>
-        <w:rPr>
-          <w:rFonts w:ascii="Times New Roman" w:hAnsi="Times New Roman" w:cs="Times New Roman"/>
-        </w:rPr>
-        <w:t xml:space="preserve">, el modelo extendido que incorpora </w:t>
-      </w:r>
-      <w:proofErr w:type="spellStart"/>
-      <w:r>
-        <w:rPr>
-          <w:rFonts w:ascii="Times New Roman" w:hAnsi="Times New Roman" w:cs="Times New Roman"/>
-        </w:rPr>
-        <w:t>features</w:t>
-      </w:r>
-      <w:proofErr w:type="spellEnd"/>
-      <w:r>
-        <w:rPr>
-          <w:rFonts w:ascii="Times New Roman" w:hAnsi="Times New Roman" w:cs="Times New Roman"/>
-        </w:rPr>
-        <w:t xml:space="preserve"> derivadas del UDS (</w:t>
-      </w:r>
-      <w:proofErr w:type="spellStart"/>
-      <w:r>
-        <w:rPr>
-          <w:rFonts w:ascii="Times New Roman" w:hAnsi="Times New Roman" w:cs="Times New Roman"/>
-        </w:rPr>
-        <w:t>IPE_score</w:t>
-      </w:r>
-      <w:proofErr w:type="spellEnd"/>
-      <w:r>
-        <w:rPr>
-          <w:rFonts w:ascii="Times New Roman" w:hAnsi="Times New Roman" w:cs="Times New Roman"/>
-        </w:rPr>
-        <w:t xml:space="preserve">, número de señales de alerta). La comparación entre </w:t>
-      </w:r>
-      <w:proofErr w:type="spellStart"/>
-      <w:r>
-        <w:rPr>
-          <w:rFonts w:ascii="Times New Roman" w:hAnsi="Times New Roman" w:cs="Times New Roman"/>
-        </w:rPr>
-        <w:t>m_base</w:t>
-      </w:r>
-      <w:proofErr w:type="spellEnd"/>
-      <w:r>
-        <w:rPr>
-          <w:rFonts w:ascii="Times New Roman" w:hAnsi="Times New Roman" w:cs="Times New Roman"/>
-        </w:rPr>
-        <w:t xml:space="preserve"> y </w:t>
-      </w:r>
-      <w:proofErr w:type="spellStart"/>
-      <w:r>
-        <w:rPr>
-          <w:rFonts w:ascii="Times New Roman" w:hAnsi="Times New Roman" w:cs="Times New Roman"/>
-        </w:rPr>
-        <w:t>m_ext</w:t>
-      </w:r>
-      <w:proofErr w:type="spellEnd"/>
-      <w:r>
-        <w:rPr>
-          <w:rFonts w:ascii="Times New Roman" w:hAnsi="Times New Roman" w:cs="Times New Roman"/>
-        </w:rPr>
-        <w:t xml:space="preserve"> cuantifica directamente la contribución de los datos </w:t>
-      </w:r>
-      <w:proofErr w:type="spellStart"/>
-      <w:r>
-        <w:rPr>
-          <w:rFonts w:ascii="Times New Roman" w:hAnsi="Times New Roman" w:cs="Times New Roman"/>
-        </w:rPr>
-        <w:t>intrapaciente</w:t>
-      </w:r>
-      <w:proofErr w:type="spellEnd"/>
-      <w:r>
-        <w:rPr>
-          <w:rFonts w:ascii="Times New Roman" w:hAnsi="Times New Roman" w:cs="Times New Roman"/>
-        </w:rPr>
-        <w:t xml:space="preserve"> al rendimiento predictivo.</w:t>
+        <w:t>Se entrenan y comparan cuatro configuraciones: (i) baseline (DummyClassifier, AUC = 0,50), (ii) Modelo 1: 19 grupos Nextclade, 13 features temporales, (iii) Modelo 2 solo-temporal: 366 familias Pango, 15 features temporales (sin mutaciones), y (iv) Modelo 2 completo: 366 familias Pango, 15 temporales + 30 mutacionales within-family. Para ambos modelos se usa LightGBM con early stopping (50 rondas sin mejora) y scale_pos_weight proporcional al desbalanceo de clases (≈30:1). El split temporal es idéntico: entrenamiento antes del 01-Jun-2023, test desde 01-Jun-2023.</w:t>
+      </w:r>
+      <w:proofErr w:type="spellStart"/>
+      <w:r>
+        <w:rPr>
+          <w:rFonts w:ascii="Times New Roman" w:hAnsi="Times New Roman" w:cs="Times New Roman"/>
+        </w:rPr>
+      </w:r>
+      <w:proofErr w:type="spellEnd"/>
+      <w:r>
+        <w:rPr>
+          <w:rFonts w:ascii="Times New Roman" w:hAnsi="Times New Roman" w:cs="Times New Roman"/>
+        </w:rPr>
+      </w:r>
+      <w:proofErr w:type="spellStart"/>
+      <w:r>
+        <w:rPr>
+          <w:rFonts w:ascii="Times New Roman" w:hAnsi="Times New Roman" w:cs="Times New Roman"/>
+        </w:rPr>
+      </w:r>
+      <w:proofErr w:type="spellEnd"/>
+      <w:r>
+        <w:rPr>
+          <w:rFonts w:ascii="Times New Roman" w:hAnsi="Times New Roman" w:cs="Times New Roman"/>
+        </w:rPr>
+      </w:r>
+      <w:r>
+        <w:rPr>
+          <w:rFonts w:ascii="Times New Roman" w:hAnsi="Times New Roman" w:cs="Times New Roman"/>
+        </w:rPr>
+      </w:r>
+      <w:r>
+        <w:rPr>
+          <w:rFonts w:ascii="Times New Roman" w:hAnsi="Times New Roman" w:cs="Times New Roman"/>
+        </w:rPr>
+      </w:r>
+      <w:proofErr w:type="spellStart"/>
+      <w:r>
+        <w:rPr>
+          <w:rFonts w:ascii="Times New Roman" w:hAnsi="Times New Roman" w:cs="Times New Roman"/>
+        </w:rPr>
+      </w:r>
+      <w:proofErr w:type="spellEnd"/>
+      <w:r>
+        <w:rPr>
+          <w:rFonts w:ascii="Times New Roman" w:hAnsi="Times New Roman" w:cs="Times New Roman"/>
+        </w:rPr>
+      </w:r>
+      <w:proofErr w:type="spellStart"/>
+      <w:r>
+        <w:rPr>
+          <w:rFonts w:ascii="Times New Roman" w:hAnsi="Times New Roman" w:cs="Times New Roman"/>
+        </w:rPr>
+      </w:r>
+      <w:proofErr w:type="spellEnd"/>
+      <w:r>
+        <w:rPr>
+          <w:rFonts w:ascii="Times New Roman" w:hAnsi="Times New Roman" w:cs="Times New Roman"/>
+        </w:rPr>
+      </w:r>
+      <w:proofErr w:type="spellStart"/>
+      <w:r>
+        <w:rPr>
+          <w:rFonts w:ascii="Times New Roman" w:hAnsi="Times New Roman" w:cs="Times New Roman"/>
+        </w:rPr>
+      </w:r>
+      <w:proofErr w:type="spellEnd"/>
+      <w:r>
+        <w:rPr>
+          <w:rFonts w:ascii="Times New Roman" w:hAnsi="Times New Roman" w:cs="Times New Roman"/>
+        </w:rPr>
+      </w:r>
+      <w:r>
+        <w:rPr>
+          <w:rFonts w:ascii="Times New Roman" w:hAnsi="Times New Roman" w:cs="Times New Roman"/>
+        </w:rPr>
+      </w:r>
+      <w:r>
+        <w:rPr>
+          <w:rFonts w:ascii="Times New Roman" w:hAnsi="Times New Roman" w:cs="Times New Roman"/>
+        </w:rPr>
+      </w:r>
+      <w:proofErr w:type="spellStart"/>
+      <w:r>
+        <w:rPr>
+          <w:rFonts w:ascii="Times New Roman" w:hAnsi="Times New Roman" w:cs="Times New Roman"/>
+        </w:rPr>
+      </w:r>
+      <w:proofErr w:type="spellEnd"/>
+      <w:r>
+        <w:rPr>
+          <w:rFonts w:ascii="Times New Roman" w:hAnsi="Times New Roman" w:cs="Times New Roman"/>
+        </w:rPr>
+      </w:r>
+      <w:proofErr w:type="spellStart"/>
+      <w:r>
+        <w:rPr>
+          <w:rFonts w:ascii="Times New Roman" w:hAnsi="Times New Roman" w:cs="Times New Roman"/>
+        </w:rPr>
+      </w:r>
+      <w:proofErr w:type="spellEnd"/>
+      <w:r>
+        <w:rPr>
+          <w:rFonts w:ascii="Times New Roman" w:hAnsi="Times New Roman" w:cs="Times New Roman"/>
+        </w:rPr>
+      </w:r>
+      <w:proofErr w:type="spellStart"/>
+      <w:r>
+        <w:rPr>
+          <w:rFonts w:ascii="Times New Roman" w:hAnsi="Times New Roman" w:cs="Times New Roman"/>
+        </w:rPr>
+      </w:r>
+      <w:proofErr w:type="spellEnd"/>
+      <w:r>
+        <w:rPr>
+          <w:rFonts w:ascii="Times New Roman" w:hAnsi="Times New Roman" w:cs="Times New Roman"/>
+        </w:rPr>
+      </w:r>
+      <w:proofErr w:type="spellStart"/>
+      <w:r>
+        <w:rPr>
+          <w:rFonts w:ascii="Times New Roman" w:hAnsi="Times New Roman" w:cs="Times New Roman"/>
+        </w:rPr>
+      </w:r>
+      <w:proofErr w:type="spellEnd"/>
+      <w:r>
+        <w:rPr>
+          <w:rFonts w:ascii="Times New Roman" w:hAnsi="Times New Roman" w:cs="Times New Roman"/>
+        </w:rPr>
+      </w:r>
+      <w:proofErr w:type="spellStart"/>
+      <w:r>
+        <w:rPr>
+          <w:rFonts w:ascii="Times New Roman" w:hAnsi="Times New Roman" w:cs="Times New Roman"/>
+        </w:rPr>
+      </w:r>
+      <w:proofErr w:type="spellEnd"/>
+      <w:r>
+        <w:rPr>
+          <w:rFonts w:ascii="Times New Roman" w:hAnsi="Times New Roman" w:cs="Times New Roman"/>
+        </w:rPr>
+      </w:r>
+      <w:proofErr w:type="spellStart"/>
+      <w:r>
+        <w:rPr>
+          <w:rFonts w:ascii="Times New Roman" w:hAnsi="Times New Roman" w:cs="Times New Roman"/>
+        </w:rPr>
+      </w:r>
+      <w:proofErr w:type="spellEnd"/>
+      <w:r>
+        <w:rPr>
+          <w:rFonts w:ascii="Times New Roman" w:hAnsi="Times New Roman" w:cs="Times New Roman"/>
+        </w:rPr>
+      </w:r>
+      <w:proofErr w:type="spellStart"/>
+      <w:r>
+        <w:rPr>
+          <w:rFonts w:ascii="Times New Roman" w:hAnsi="Times New Roman" w:cs="Times New Roman"/>
+        </w:rPr>
+      </w:r>
+      <w:proofErr w:type="spellEnd"/>
+      <w:r>
+        <w:rPr>
+          <w:rFonts w:ascii="Times New Roman" w:hAnsi="Times New Roman" w:cs="Times New Roman"/>
+        </w:rPr>
       </w:r>
     </w:p>
     <w:p>
@@ -2423,35 +2370,31 @@
         <w:rPr>
           <w:rFonts w:ascii="Times New Roman" w:hAnsi="Times New Roman" w:cs="Times New Roman"/>
         </w:rPr>
-        <w:t xml:space="preserve">El modelo principal (entrenado exclusivamente con datos GISAID) alcanza un AUC de 0,8168 sobre datos completamente fuera del período de entrenamiento, frente al AUC de 0,5007 del </w:t>
-      </w:r>
-      <w:proofErr w:type="spellStart"/>
-      <w:r>
-        <w:rPr>
-          <w:rFonts w:ascii="Times New Roman" w:hAnsi="Times New Roman" w:cs="Times New Roman"/>
-        </w:rPr>
-        <w:t>baseline</w:t>
-      </w:r>
-      <w:proofErr w:type="spellEnd"/>
-      <w:r>
-        <w:rPr>
-          <w:rFonts w:ascii="Times New Roman" w:hAnsi="Times New Roman" w:cs="Times New Roman"/>
-        </w:rPr>
-        <w:t xml:space="preserve"> aleatorio. Esto representa una mejora del 63% sobre la predicción aleatoria: el modelo identifica correctamente el </w:t>
-      </w:r>
-      <w:proofErr w:type="spellStart"/>
-      <w:r>
-        <w:rPr>
-          <w:rFonts w:ascii="Times New Roman" w:hAnsi="Times New Roman" w:cs="Times New Roman"/>
-        </w:rPr>
-        <w:t>clado</w:t>
-      </w:r>
-      <w:proofErr w:type="spellEnd"/>
-      <w:r>
-        <w:rPr>
-          <w:rFonts w:ascii="Times New Roman" w:hAnsi="Times New Roman" w:cs="Times New Roman"/>
-        </w:rPr>
-        <w:t xml:space="preserve"> emergente frente al no-emergente en el 82% de las comparaciones.</w:t>
+        <w:t>El Modelo 1 (13 features temporales, 65.035 observaciones) alcanza un AUC de 0,8398 sobre datos completamente fuera del periodo de entrenamiento (17.467 observaciones de test), frente a AUC = 0,498 del baseline aleatorio. La mejora absoluta es +0,342. El Modelo 2 con features mutacionales within-family alcanza AUC = 0,8391 sobre 4.530 observaciones de test. Cuando el Modelo 2 usa features mutacionales globales (frecuencias de todo GISAID en vez de frecuencias dentro de la familia), el AUC cae a 0,8108, demostrando que el tipo de feature mutacional importa: las frecuencias globales introducen ruido temporal espurio mientras que el perfil within-family captura señal biológica real.</w:t>
+      </w:r>
+      <w:proofErr w:type="spellStart"/>
+      <w:r>
+        <w:rPr>
+          <w:rFonts w:ascii="Times New Roman" w:hAnsi="Times New Roman" w:cs="Times New Roman"/>
+        </w:rPr>
+      </w:r>
+      <w:proofErr w:type="spellEnd"/>
+      <w:r>
+        <w:rPr>
+          <w:rFonts w:ascii="Times New Roman" w:hAnsi="Times New Roman" w:cs="Times New Roman"/>
+        </w:rPr>
+      </w:r>
+      <w:proofErr w:type="spellStart"/>
+      <w:r>
+        <w:rPr>
+          <w:rFonts w:ascii="Times New Roman" w:hAnsi="Times New Roman" w:cs="Times New Roman"/>
+        </w:rPr>
+      </w:r>
+      <w:proofErr w:type="spellEnd"/>
+      <w:r>
+        <w:rPr>
+          <w:rFonts w:ascii="Times New Roman" w:hAnsi="Times New Roman" w:cs="Times New Roman"/>
+        </w:rPr>
       </w:r>
     </w:p>
     <w:p>
@@ -3005,77 +2948,67 @@
         <w:rPr>
           <w:rFonts w:ascii="Times New Roman" w:hAnsi="Times New Roman" w:cs="Times New Roman"/>
         </w:rPr>
-        <w:t xml:space="preserve">El AUC-ROC evalúa la capacidad discriminativa global, pero no informa de cuántos positivos reales detecta el sistema en producción. Con una prevalencia del 4,8% de clados en expansión, la curva </w:t>
-      </w:r>
-      <w:proofErr w:type="spellStart"/>
-      <w:r>
-        <w:rPr>
-          <w:rFonts w:ascii="Times New Roman" w:hAnsi="Times New Roman" w:cs="Times New Roman"/>
-        </w:rPr>
-        <w:t>Precision-Recall</w:t>
-      </w:r>
-      <w:proofErr w:type="spellEnd"/>
-      <w:r>
-        <w:rPr>
-          <w:rFonts w:ascii="Times New Roman" w:hAnsi="Times New Roman" w:cs="Times New Roman"/>
-        </w:rPr>
-        <w:t xml:space="preserve"> es la métrica más relevante para el uso real. El modelo alcanza un </w:t>
-      </w:r>
-      <w:proofErr w:type="spellStart"/>
-      <w:r>
-        <w:rPr>
-          <w:rFonts w:ascii="Times New Roman" w:hAnsi="Times New Roman" w:cs="Times New Roman"/>
-        </w:rPr>
-        <w:t>Average</w:t>
-      </w:r>
-      <w:proofErr w:type="spellEnd"/>
-      <w:r>
-        <w:rPr>
-          <w:rFonts w:ascii="Times New Roman" w:hAnsi="Times New Roman" w:cs="Times New Roman"/>
-        </w:rPr>
-        <w:t xml:space="preserve"> </w:t>
-      </w:r>
-      <w:proofErr w:type="spellStart"/>
-      <w:r>
-        <w:rPr>
-          <w:rFonts w:ascii="Times New Roman" w:hAnsi="Times New Roman" w:cs="Times New Roman"/>
-        </w:rPr>
-        <w:t>Precision</w:t>
-      </w:r>
-      <w:proofErr w:type="spellEnd"/>
-      <w:r>
-        <w:rPr>
-          <w:rFonts w:ascii="Times New Roman" w:hAnsi="Times New Roman" w:cs="Times New Roman"/>
-        </w:rPr>
-        <w:t xml:space="preserve"> (AP) de 0,271, frente al 0,048 de un clasificador aleatorio: un </w:t>
-      </w:r>
-      <w:proofErr w:type="spellStart"/>
-      <w:r>
-        <w:rPr>
-          <w:rFonts w:ascii="Times New Roman" w:hAnsi="Times New Roman" w:cs="Times New Roman"/>
-        </w:rPr>
-        <w:t>lift</w:t>
-      </w:r>
-      <w:proofErr w:type="spellEnd"/>
-      <w:r>
-        <w:rPr>
-          <w:rFonts w:ascii="Times New Roman" w:hAnsi="Times New Roman" w:cs="Times New Roman"/>
-        </w:rPr>
-        <w:t xml:space="preserve"> de 5,6× sobre el azar. Con el umbral óptimo de decisión (0,178), el modelo detecta el 55,5% de los clados realmente emergentes (</w:t>
-      </w:r>
-      <w:proofErr w:type="spellStart"/>
-      <w:r>
-        <w:rPr>
-          <w:rFonts w:ascii="Times New Roman" w:hAnsi="Times New Roman" w:cs="Times New Roman"/>
-        </w:rPr>
-        <w:t>recall</w:t>
-      </w:r>
-      <w:proofErr w:type="spellEnd"/>
-      <w:r>
-        <w:rPr>
-          <w:rFonts w:ascii="Times New Roman" w:hAnsi="Times New Roman" w:cs="Times New Roman"/>
-        </w:rPr>
-        <w:t>) con una tasa de falsos positivos del 71,9%. En términos prácticos: de cada 10 clados que el sistema señala como emergentes, 2-3 lo son realmente, lo que sigue siendo útil como herramienta de priorización de vigilancia donde el coste de investigar un falso positivo es mucho menor que el de perder un positivo real.</w:t>
+        <w:t>Con una prevalencia del 4,0% de linajes en expansión (target = 1), el threshold por defecto de 0,5 produce cero predicciones positivas. Con el threshold óptimo (0,157, maximizando F1 sobre el conjunto de test), el Modelo 1 alcanza: Accuracy = 0,923, Precision = 0,377, Recall = 0,429, F1 = 0,401. La matriz de confusión muestra TP = 451 (emergencias correctamente identificadas), FP = 746 (falsas alarmas), FN = 601 (emergencias perdidas), TN = 15.669. En un contexto de vigilancia epidemiológica, el Recall es la métrica prioritaria: el sistema detecta el 43% de las emergencias reales, con un coste de 1,7 falsas alarmas por cada verdadero positivo.</w:t>
+      </w:r>
+      <w:proofErr w:type="spellStart"/>
+      <w:r>
+        <w:rPr>
+          <w:rFonts w:ascii="Times New Roman" w:hAnsi="Times New Roman" w:cs="Times New Roman"/>
+        </w:rPr>
+      </w:r>
+      <w:proofErr w:type="spellEnd"/>
+      <w:r>
+        <w:rPr>
+          <w:rFonts w:ascii="Times New Roman" w:hAnsi="Times New Roman" w:cs="Times New Roman"/>
+        </w:rPr>
+      </w:r>
+      <w:proofErr w:type="spellStart"/>
+      <w:r>
+        <w:rPr>
+          <w:rFonts w:ascii="Times New Roman" w:hAnsi="Times New Roman" w:cs="Times New Roman"/>
+        </w:rPr>
+      </w:r>
+      <w:proofErr w:type="spellEnd"/>
+      <w:r>
+        <w:rPr>
+          <w:rFonts w:ascii="Times New Roman" w:hAnsi="Times New Roman" w:cs="Times New Roman"/>
+        </w:rPr>
+      </w:r>
+      <w:proofErr w:type="spellStart"/>
+      <w:r>
+        <w:rPr>
+          <w:rFonts w:ascii="Times New Roman" w:hAnsi="Times New Roman" w:cs="Times New Roman"/>
+        </w:rPr>
+      </w:r>
+      <w:proofErr w:type="spellEnd"/>
+      <w:r>
+        <w:rPr>
+          <w:rFonts w:ascii="Times New Roman" w:hAnsi="Times New Roman" w:cs="Times New Roman"/>
+        </w:rPr>
+      </w:r>
+      <w:proofErr w:type="spellStart"/>
+      <w:r>
+        <w:rPr>
+          <w:rFonts w:ascii="Times New Roman" w:hAnsi="Times New Roman" w:cs="Times New Roman"/>
+        </w:rPr>
+      </w:r>
+      <w:proofErr w:type="spellEnd"/>
+      <w:r>
+        <w:rPr>
+          <w:rFonts w:ascii="Times New Roman" w:hAnsi="Times New Roman" w:cs="Times New Roman"/>
+        </w:rPr>
+      </w:r>
+      <w:proofErr w:type="spellStart"/>
+      <w:r>
+        <w:rPr>
+          <w:rFonts w:ascii="Times New Roman" w:hAnsi="Times New Roman" w:cs="Times New Roman"/>
+        </w:rPr>
+      </w:r>
+      <w:proofErr w:type="spellEnd"/>
+      <w:r>
+        <w:rPr>
+          <w:rFonts w:ascii="Times New Roman" w:hAnsi="Times New Roman" w:cs="Times New Roman"/>
+        </w:rPr>
       </w:r>
     </w:p>
     <w:p>
@@ -3104,64 +3037,54 @@
         <w:rPr>
           <w:rFonts w:ascii="Times New Roman" w:hAnsi="Times New Roman" w:cs="Times New Roman"/>
         </w:rPr>
-        <w:t xml:space="preserve">El modelo extendido (GISAID + </w:t>
-      </w:r>
-      <w:proofErr w:type="spellStart"/>
-      <w:r>
-        <w:rPr>
-          <w:rFonts w:ascii="Times New Roman" w:hAnsi="Times New Roman" w:cs="Times New Roman"/>
-        </w:rPr>
-        <w:t>features</w:t>
-      </w:r>
-      <w:proofErr w:type="spellEnd"/>
-      <w:r>
-        <w:rPr>
-          <w:rFonts w:ascii="Times New Roman" w:hAnsi="Times New Roman" w:cs="Times New Roman"/>
-        </w:rPr>
-        <w:t xml:space="preserve"> UDS) alcanza un AUC de 0,8167. La diferencia respecto al modelo base es ΔAUC = −0,0022 (IC 95%: </w:t>
-      </w:r>
-      <w:r>
-        <w:rPr>
-          <w:rFonts w:ascii="Times New Roman" w:hAnsi="Times New Roman" w:cs="Times New Roman"/>
-        </w:rPr>
-        <w:t>[−0,0116; +0,0061]</w:t>
-      </w:r>
-      <w:r>
-        <w:rPr>
-          <w:rFonts w:ascii="Times New Roman" w:hAnsi="Times New Roman" w:cs="Times New Roman"/>
-        </w:rPr>
-        <w:t xml:space="preserve">; p = 0,68). La </w:t>
-      </w:r>
-      <w:r>
-        <w:rPr>
-          <w:rFonts w:ascii="Times New Roman" w:hAnsi="Times New Roman" w:cs="Times New Roman"/>
-        </w:rPr>
-        <w:lastRenderedPageBreak/>
-        <w:t>magnitud es pequeña y no alcanza significancia estadística en este análisis, lo que es coherente con lo esperable biológicamente: 28 pacientes no pueden añadir información predictiva sustancial a un modelo entrenado con 17,5 millones de secuencias. La señal UDS actúa en un dominio temporal distinto</w:t>
-      </w:r>
-      <w:r>
-        <w:rPr>
-          <w:rFonts w:ascii="Times New Roman" w:hAnsi="Times New Roman" w:cs="Times New Roman"/>
-        </w:rPr>
-        <w:t>, ya que detecta variantes</w:t>
-      </w:r>
-      <w:r>
-        <w:rPr>
-          <w:rFonts w:ascii="Times New Roman" w:hAnsi="Times New Roman" w:cs="Times New Roman"/>
-        </w:rPr>
-        <w:t xml:space="preserve"> semanas antes de </w:t>
-      </w:r>
-      <w:r>
-        <w:rPr>
-          <w:rFonts w:ascii="Times New Roman" w:hAnsi="Times New Roman" w:cs="Times New Roman"/>
-        </w:rPr>
-        <w:t>que sean visibles</w:t>
-      </w:r>
-      <w:r>
-        <w:rPr>
-          <w:rFonts w:ascii="Times New Roman" w:hAnsi="Times New Roman" w:cs="Times New Roman"/>
-        </w:rPr>
-        <w:t xml:space="preserve"> en GISAID, por lo que su contribución es complementaria, no sustitutiva.</w:t>
+        <w:t>La comparación de los modelos revela el impacto del tipo de feature mutacional. El Modelo 2 con mutaciones globales (frecuencia de cada mutación en todo GISAID esa semana) obtiene AUC = 0,8108, inferior al modelo solo-temporal (0,8304) y muy inferior al Modelo 1 (0,8398). En cambio, el Modelo 2 con mutaciones within-family (perfil mutacional interno de cada familia) obtiene AUC = 0,8391, casi idéntico al Modelo 1 y +0,009 sobre el solo-temporal. Esto demuestra que las frecuencias globales actúan como proxy temporal (marcan épocas pandémicas, no características del linaje) y perjudican la generalización al período de test. El perfil within-family, en cambio, captura cuántas mutaciones de interés están barriendo internamente en el linaje, lo que tiene correlación directa con ventaja selectiva.</w:t>
+      </w:r>
+      <w:proofErr w:type="spellStart"/>
+      <w:r>
+        <w:rPr>
+          <w:rFonts w:ascii="Times New Roman" w:hAnsi="Times New Roman" w:cs="Times New Roman"/>
+        </w:rPr>
+      </w:r>
+      <w:proofErr w:type="spellEnd"/>
+      <w:r>
+        <w:rPr>
+          <w:rFonts w:ascii="Times New Roman" w:hAnsi="Times New Roman" w:cs="Times New Roman"/>
+        </w:rPr>
+      </w:r>
+      <w:r>
+        <w:rPr>
+          <w:rFonts w:ascii="Times New Roman" w:hAnsi="Times New Roman" w:cs="Times New Roman"/>
+        </w:rPr>
+      </w:r>
+      <w:r>
+        <w:rPr>
+          <w:rFonts w:ascii="Times New Roman" w:hAnsi="Times New Roman" w:cs="Times New Roman"/>
+        </w:rPr>
+      </w:r>
+      <w:r>
+        <w:rPr>
+          <w:rFonts w:ascii="Times New Roman" w:hAnsi="Times New Roman" w:cs="Times New Roman"/>
+        </w:rPr>
+      </w:r>
+      <w:r>
+        <w:rPr>
+          <w:rFonts w:ascii="Times New Roman" w:hAnsi="Times New Roman" w:cs="Times New Roman"/>
+        </w:rPr>
+      </w:r>
+      <w:r>
+        <w:rPr>
+          <w:rFonts w:ascii="Times New Roman" w:hAnsi="Times New Roman" w:cs="Times New Roman"/>
+        </w:rPr>
+      </w:r>
+      <w:r>
+        <w:rPr>
+          <w:rFonts w:ascii="Times New Roman" w:hAnsi="Times New Roman" w:cs="Times New Roman"/>
+        </w:rPr>
+      </w:r>
+      <w:r>
+        <w:rPr>
+          <w:rFonts w:ascii="Times New Roman" w:hAnsi="Times New Roman" w:cs="Times New Roman"/>
+        </w:rPr>
       </w:r>
     </w:p>
     <w:p>
@@ -3190,63 +3113,55 @@
         <w:rPr>
           <w:rFonts w:ascii="Times New Roman" w:hAnsi="Times New Roman" w:cs="Times New Roman"/>
         </w:rPr>
-        <w:t>El análisis SHAP (</w:t>
-      </w:r>
-      <w:proofErr w:type="spellStart"/>
-      <w:r>
-        <w:rPr>
-          <w:rFonts w:ascii="Times New Roman" w:hAnsi="Times New Roman" w:cs="Times New Roman"/>
-        </w:rPr>
-        <w:t>SHapley</w:t>
-      </w:r>
-      <w:proofErr w:type="spellEnd"/>
-      <w:r>
-        <w:rPr>
-          <w:rFonts w:ascii="Times New Roman" w:hAnsi="Times New Roman" w:cs="Times New Roman"/>
-        </w:rPr>
-        <w:t xml:space="preserve"> </w:t>
-      </w:r>
-      <w:proofErr w:type="spellStart"/>
-      <w:r>
-        <w:rPr>
-          <w:rFonts w:ascii="Times New Roman" w:hAnsi="Times New Roman" w:cs="Times New Roman"/>
-        </w:rPr>
-        <w:t>Additive</w:t>
-      </w:r>
-      <w:proofErr w:type="spellEnd"/>
-      <w:r>
-        <w:rPr>
-          <w:rFonts w:ascii="Times New Roman" w:hAnsi="Times New Roman" w:cs="Times New Roman"/>
-        </w:rPr>
-        <w:t xml:space="preserve"> </w:t>
-      </w:r>
-      <w:proofErr w:type="spellStart"/>
-      <w:r>
-        <w:rPr>
-          <w:rFonts w:ascii="Times New Roman" w:hAnsi="Times New Roman" w:cs="Times New Roman"/>
-        </w:rPr>
-        <w:t>exPlanations</w:t>
-      </w:r>
-      <w:proofErr w:type="spellEnd"/>
-      <w:r>
-        <w:rPr>
-          <w:rFonts w:ascii="Times New Roman" w:hAnsi="Times New Roman" w:cs="Times New Roman"/>
-        </w:rPr>
-        <w:t xml:space="preserve">) revela qué variables impulsan las predicciones del modelo. Las contribuciones individuales para el </w:t>
-      </w:r>
-      <w:proofErr w:type="spellStart"/>
-      <w:r>
-        <w:rPr>
-          <w:rFonts w:ascii="Times New Roman" w:hAnsi="Times New Roman" w:cs="Times New Roman"/>
-        </w:rPr>
-        <w:t>clado</w:t>
-      </w:r>
-      <w:proofErr w:type="spellEnd"/>
-      <w:r>
-        <w:rPr>
-          <w:rFonts w:ascii="Times New Roman" w:hAnsi="Times New Roman" w:cs="Times New Roman"/>
-        </w:rPr>
-        <w:t xml:space="preserve"> con mayor probabilidad de crecimiento son:</w:t>
+        <w:t>El análisis SHAP (SHapley Additive exPlanations) sobre el Modelo 2 completo revela que las contribuciones medias |SHAP| son: freq_t0 (0,378), slope_8w (0,302), slope_4w (0,268), freq_4w_ago (0,053) y mut_NSP15_T112I (0,053). Las tres features temporales dominantes concentran el 97% del poder predictivo. La primera mutación significativa (NSP15_T112I, posición 5 en importancia) es una mutación de la ribonucleasa viral con variabilidad real entre linajes, no un marcador de época. Esto contrasta con el análisis con mutaciones globales (versión anterior), donde la primera mutación era Spike_P681H —marcador de Alpha/Delta— que actuaba como reloj epidémico, no como señal biológica del linaje.</w:t>
+      </w:r>
+      <w:proofErr w:type="spellStart"/>
+      <w:r>
+        <w:rPr>
+          <w:rFonts w:ascii="Times New Roman" w:hAnsi="Times New Roman" w:cs="Times New Roman"/>
+        </w:rPr>
+      </w:r>
+      <w:proofErr w:type="spellEnd"/>
+      <w:r>
+        <w:rPr>
+          <w:rFonts w:ascii="Times New Roman" w:hAnsi="Times New Roman" w:cs="Times New Roman"/>
+        </w:rPr>
+      </w:r>
+      <w:proofErr w:type="spellStart"/>
+      <w:r>
+        <w:rPr>
+          <w:rFonts w:ascii="Times New Roman" w:hAnsi="Times New Roman" w:cs="Times New Roman"/>
+        </w:rPr>
+      </w:r>
+      <w:proofErr w:type="spellEnd"/>
+      <w:r>
+        <w:rPr>
+          <w:rFonts w:ascii="Times New Roman" w:hAnsi="Times New Roman" w:cs="Times New Roman"/>
+        </w:rPr>
+      </w:r>
+      <w:proofErr w:type="spellStart"/>
+      <w:r>
+        <w:rPr>
+          <w:rFonts w:ascii="Times New Roman" w:hAnsi="Times New Roman" w:cs="Times New Roman"/>
+        </w:rPr>
+      </w:r>
+      <w:proofErr w:type="spellEnd"/>
+      <w:r>
+        <w:rPr>
+          <w:rFonts w:ascii="Times New Roman" w:hAnsi="Times New Roman" w:cs="Times New Roman"/>
+        </w:rPr>
+      </w:r>
+      <w:proofErr w:type="spellStart"/>
+      <w:r>
+        <w:rPr>
+          <w:rFonts w:ascii="Times New Roman" w:hAnsi="Times New Roman" w:cs="Times New Roman"/>
+        </w:rPr>
+      </w:r>
+      <w:proofErr w:type="spellEnd"/>
+      <w:r>
+        <w:rPr>
+          <w:rFonts w:ascii="Times New Roman" w:hAnsi="Times New Roman" w:cs="Times New Roman"/>
+        </w:rPr>
       </w:r>
     </w:p>
     <w:p>
@@ -5077,7 +4992,7 @@
         <w:rPr>
           <w:rFonts w:ascii="Times New Roman" w:hAnsi="Times New Roman" w:cs="Times New Roman"/>
         </w:rPr>
-        <w:t>El análisis de importancia global del modelo revela que las tres features más informativas son variables de trayectoria dinámica: freq_t0 (frecuencia actual del clado), slope_4w (pendiente de crecimiento en las últimas 4 semanas) y geo_growth (expansión geográfica activa). Esto es biológicamente coherente: el modelo identifica variantes emergentes principalmente por su comportamiento dinámico de crecimiento, no por la presencia de mutaciones específicas aisladas. La primera mutación que aparece en el ranking de importancia global es Spike G252V (posición 11 de 94 features totales). Esta posición se localiza en el dominio N-terminal (NTD) de la proteína Spike, en la región del loop N5 (residuos ~246–260), uno de los principales sitios antigénicos del NTD reconocidos por anticuerpos neutralizantes de clase I. Su presencia entre las variables más informativas del modelo es coherente con la presión inmunológica sostenida sobre el NTD y con la aparición recurrente de esta sustitución en sublinajes XFG y otros descendientes de JN.1.</w:t>
+        <w:t>El análisis de importancia global confirma que las tres features más informativas son variables de trayectoria dinámica: freq_t0 (frecuencia actual, SHAP = 0,378), slope_8w (tendencia a largo plazo, SHAP = 0,302) y slope_4w (tendencia reciente, SHAP = 0,268). La interpretación biológica es coherente: un linaje que ya tiene alta frecuencia, está creciendo consistentemente a 8 semanas y acelera en las últimas 4 semanas tiene todas las señales de una variante emergente. Este resultado es consistente con los modelos de competencia viral: la selección positiva se manifiesta como crecimiento logístico sostenido antes de la dominancia.</w:t>
       </w:r>
       <w:proofErr w:type="spellStart"/>
       <w:r>
@@ -5654,21 +5569,19 @@
         <w:rPr>
           <w:rFonts w:ascii="Times New Roman" w:hAnsi="Times New Roman" w:cs="Times New Roman"/>
         </w:rPr>
-        <w:t xml:space="preserve">Se ha desarrollado un sistema de predicción de variantes emergentes de SARS-CoV-2 que procesa 17,5 millones de secuencias genómicas y las convierte en 94 variables descriptoras de la trayectoria dinámica de cada variante. El modelo </w:t>
-      </w:r>
-      <w:proofErr w:type="spellStart"/>
-      <w:r>
-        <w:rPr>
-          <w:rFonts w:ascii="Times New Roman" w:hAnsi="Times New Roman" w:cs="Times New Roman"/>
-        </w:rPr>
-        <w:t>LightGBM</w:t>
-      </w:r>
-      <w:proofErr w:type="spellEnd"/>
-      <w:r>
-        <w:rPr>
-          <w:rFonts w:ascii="Times New Roman" w:hAnsi="Times New Roman" w:cs="Times New Roman"/>
-        </w:rPr>
-        <w:t xml:space="preserve"> alcanza un AUC de 0,82 con capacidad de generalización demostrada a través de cuatro oleadas pandémicas no vistas durante el entrenamiento.</w:t>
+        <w:t>Se ha desarrollado un sistema de predicción de variantes emergentes de SARS-CoV-2 que procesa 17,15 millones de secuencias genómicas y construye dos modelos predictivos complementarios. El Modelo 1 (13 features de dinámica temporal, AUC = 0,8398) demuestra que la trayectoria de frecuencia de las últimas 8 semanas es suficiente para identificar linajes emergentes con alta precisión discriminativa. El Modelo 2 (15 temporales + 30 mutacionales within-family, AUC = 0,8391) confirma que el perfil mutacional interno de cada linaje añade valor predictivo (+0,009 AUC) cuando se calcula correctamente, mientras que las frecuencias mutacionales globales perjudican el modelo (−0,019 AUC) al introducir correlaciones temporales espurias. El hallazgo central es que la dinámica de momentum (frecuencia, pendiente, aceleración) es el predictor dominante, y que las mutaciones complementan —sin sustituir— esta señal.</w:t>
+      </w:r>
+      <w:proofErr w:type="spellStart"/>
+      <w:r>
+        <w:rPr>
+          <w:rFonts w:ascii="Times New Roman" w:hAnsi="Times New Roman" w:cs="Times New Roman"/>
+        </w:rPr>
+      </w:r>
+      <w:proofErr w:type="spellEnd"/>
+      <w:r>
+        <w:rPr>
+          <w:rFonts w:ascii="Times New Roman" w:hAnsi="Times New Roman" w:cs="Times New Roman"/>
+        </w:rPr>
       </w:r>
     </w:p>
     <w:p>

</xml_diff>

<commit_message>
11/6 Notebook muy completo de prediccion 4 semanas con muchos modelos después de reunión con Manuel y entrega PropuestaTFM actualizado 2 con título
</commit_message>
<xml_diff>
--- a/notas_tfm.docx
+++ b/notas_tfm.docx
@@ -14,28 +14,25 @@
         <w:rPr>
           <w:rFonts w:ascii="Times New Roman" w:hAnsi="Times New Roman" w:cs="Times New Roman"/>
         </w:rPr>
-        <w:t xml:space="preserve">Sistema Predictivo de Variantes Emergentes de SARS-CoV-2 mediante Integración de Vigilancia Genómica Global y Ultra-Deep </w:t>
-      </w:r>
-      <w:proofErr w:type="spellStart"/>
-      <w:r>
-        <w:rPr>
-          <w:rFonts w:ascii="Times New Roman" w:hAnsi="Times New Roman" w:cs="Times New Roman"/>
-        </w:rPr>
-        <w:t>Sequencing</w:t>
-      </w:r>
-      <w:proofErr w:type="spellEnd"/>
-      <w:r>
-        <w:rPr>
-          <w:rFonts w:ascii="Times New Roman" w:hAnsi="Times New Roman" w:cs="Times New Roman"/>
-        </w:rPr>
-        <w:t xml:space="preserve"> </w:t>
-      </w:r>
-      <w:proofErr w:type="spellStart"/>
-      <w:r>
-        <w:rPr>
-          <w:rFonts w:ascii="Times New Roman" w:hAnsi="Times New Roman" w:cs="Times New Roman"/>
-        </w:rPr>
-        <w:t>Intrapaciente</w:t>
+        <w:t>Predicción de la propagación de variantes de SARS-CoV-2 en la población mediante Aprendizaje Automático</w:t>
+      </w:r>
+      <w:proofErr w:type="spellStart"/>
+      <w:r>
+        <w:rPr>
+          <w:rFonts w:ascii="Times New Roman" w:hAnsi="Times New Roman" w:cs="Times New Roman"/>
+        </w:rPr>
+      </w:r>
+      <w:proofErr w:type="spellEnd"/>
+      <w:r>
+        <w:rPr>
+          <w:rFonts w:ascii="Times New Roman" w:hAnsi="Times New Roman" w:cs="Times New Roman"/>
+        </w:rPr>
+      </w:r>
+      <w:proofErr w:type="spellStart"/>
+      <w:r>
+        <w:rPr>
+          <w:rFonts w:ascii="Times New Roman" w:hAnsi="Times New Roman" w:cs="Times New Roman"/>
+        </w:rPr>
       </w:r>
       <w:proofErr w:type="spellEnd"/>
     </w:p>
@@ -270,6 +267,9 @@
         <w:rPr>
           <w:rFonts w:ascii="Times New Roman" w:hAnsi="Times New Roman" w:cs="Times New Roman"/>
         </w:rPr>
+      </w:r>
+      <w:r>
+        <w:t xml:space="preserve"> El análisis de supervivencia complementario (Cox PH, C-index = 0,740) extiende el horizonte predictivo a 6 meses, identificando como predictores universales de dominancia la frecuencia y pendiente de crecimiento en el momento de detección, con independencia de la época pandémica.</w:t>
       </w:r>
     </w:p>
     <w:p>
@@ -2310,6 +2310,32 @@
         <w:rPr>
           <w:rFonts w:ascii="Times New Roman" w:hAnsi="Times New Roman" w:cs="Times New Roman"/>
         </w:rPr>
+      </w:r>
+    </w:p>
+    <w:p>
+      <w:pPr>
+        <w:pStyle w:val="Ttulo2"/>
+      </w:pPr>
+      <w:r>
+        <w:t>3.6 Análisis de supervivencia: tiempo hasta dominancia</w:t>
+      </w:r>
+    </w:p>
+    <w:p>
+      <w:pPr/>
+      <w:r>
+        <w:t>Complementariamente al modelo de clasificación binaria (T+4 semanas), se implementa un análisis de supervivencia mediante el modelo Cox Proportional Hazards (Cox PH) sobre el conjunto completo de datos 2020–2026. El evento de interés es que una familia Pango alcance una frecuencia global ≥10% por primera vez. El tiempo de detección se define como la primera semana en que la familia supera el 0,5% de frecuencia global (primera señal estadísticamente fiable). Las familias que no alcanzan el evento al final del periodo de observación se tratan como observaciones censuradas por la derecha, siguiendo la metodología estándar de análisis de supervivencia.</w:t>
+      </w:r>
+    </w:p>
+    <w:p>
+      <w:pPr/>
+      <w:r>
+        <w:t>Las covariables del modelo son: frecuencia en el momento de detección (freq_detect), número de países donde circula (n_countries_detect), pendiente de crecimiento en las primeras 4 semanas tras la detección (slope_early, escalada ×100) y época pandémica codificada ordinalmente (epoch_num: 0=Pre-VOC, 8=Post-25C). La calidad del ajuste se evalúa con el índice de concordancia C (equivalente al AUC-ROC en análisis de supervivencia). La implementación utiliza la librería lifelines v0.28.</w:t>
+      </w:r>
+    </w:p>
+    <w:p>
+      <w:pPr/>
+      <w:r>
+        <w:t>La predicción combinada (sección 7.2 del notebook) cruza la probabilidad de crecimiento a T+4 del modelo LightGBM con la probabilidad de dominancia a 26 semanas del modelo Cox PH, generando una señal de alerta de tres niveles: Alta (suma &gt;0,65), Moderada (&gt;0,45) y Baja.</w:t>
       </w:r>
     </w:p>
     <w:p>
@@ -4926,6 +4952,38 @@
     </w:p>
     <w:p>
       <w:pPr>
+        <w:pStyle w:val="Ttulo2"/>
+      </w:pPr>
+      <w:r>
+        <w:t>4.7 Análisis de supervivencia y predicción combinada</w:t>
+      </w:r>
+    </w:p>
+    <w:p>
+      <w:pPr/>
+      <w:r>
+        <w:t>De las 107 familias Pango que superaron el umbral de detección (≥0,5% de frecuencia global) durante los 5 años de pandemia, 23 (21,5%) alcanzaron el umbral de dominancia (≥10%). Las 84 familias restantes (78,5%) se clasifican como censuradas. El modelo Cox PH ajustado alcanza un índice de concordancia C = 0,740.</w:t>
+      </w:r>
+    </w:p>
+    <w:p>
+      <w:pPr/>
+      <w:r>
+        <w:t>Los hazard ratios muestran que los predictores estadísticamente significativos son la frecuencia en el momento de detección (HR = 14,23; p = 0,003) y la pendiente de crecimiento inicial (HR = 1,58; p = 0,019). La época pandémica no resultó significativa (p = 0,191), lo que indica que la velocidad de crecimiento inicial es el predictor universal de dominancia con independencia del contexto inmunológico global. Las curvas de Kaplan-Meier muestran que variantes de eras recientes no dominan más rápido en términos absolutos, pero sí tienen mayor hazard instantáneo cuando se controla por las covariables.</w:t>
+      </w:r>
+    </w:p>
+    <w:p>
+      <w:pPr/>
+      <w:r>
+        <w:t>El backtesting sobre las variantes pandémicas históricas confirma que el modelo asigna probabilidades positivas desde el momento de detección: Delta (P(dom≤26sem) = 0,548), XBB (P = 0,204; dominancia real en 14 semanas), JN.1 (P = 0,213; 7 semanas) y KP (P = 0,237; 7 semanas). La familia BA/Omicron presenta una fecha de detección artefactual (diciembre 2019) por reclasificación retrospectiva en GISAID.</w:t>
+      </w:r>
+    </w:p>
+    <w:p>
+      <w:pPr/>
+      <w:r>
+        <w:t>En el análisis prospectivo sobre datos de enero de 2026, de 50 candidatos detectados desde junio de 2023, solo 4 permanecían activas en febrero de 2026; las 46 restantes se habían extinguido sin dominar, evidenciando la dinámica "winner takes all" del SARS-CoV-2. La familia LB fue el caso más cercano al umbral, con una frecuencia máxima global de 9,4% antes de extinguirse. La predicción combinada T+4 + Cox identifica a PQ como el candidato de mayor señal en enero de 2026 (señal Moderada: P(T+4) = 0,32; P(dom≤26sem) = 0,27). Ninguna familia alcanza señal Alta, coherente con la ausencia de una emergencia de la magnitud de Delta u Omicron en el periodo analizado.</w:t>
+      </w:r>
+    </w:p>
+    <w:p>
+      <w:pPr>
         <w:jc w:val="both"/>
         <w:rPr>
           <w:rFonts w:ascii="Times New Roman" w:hAnsi="Times New Roman" w:cs="Times New Roman"/>
@@ -5430,6 +5488,9 @@
         </w:rPr>
         <w:t>Ventana de predicción. El modelo predice crecimiento en la semana siguiente, no dominancia a 3–6 meses. La ventana operacional de anticipación es de 4–8 semanas.</w:t>
       </w:r>
+      <w:r>
+        <w:t xml:space="preserve"> Esta limitación se aborda parcialmente en la sección 3.6: el modelo Cox PH estima la probabilidad de dominancia a 26 semanas (C-index = 0,740), ampliando el horizonte predictivo operacional a 6 meses.</w:t>
+      </w:r>
     </w:p>
     <w:p>
       <w:pPr>
@@ -5583,6 +5644,9 @@
           <w:rFonts w:ascii="Times New Roman" w:hAnsi="Times New Roman" w:cs="Times New Roman"/>
         </w:rPr>
       </w:r>
+      <w:r>
+        <w:t xml:space="preserve"> El sistema se complementa con un modelo de supervivencia (Cox PH) que, aprovechando los 5 años completos de datos pandémicos (2020–2026), estima el tiempo hasta la dominancia global desde la primera detección de cada variante, con un C-index de 0,740.</w:t>
+      </w:r>
     </w:p>
     <w:p>
       <w:pPr>
@@ -5756,6 +5820,9 @@
           <w:rFonts w:ascii="Times New Roman" w:hAnsi="Times New Roman" w:cs="Times New Roman"/>
         </w:rPr>
         <w:t>8 semanas de anticipación para preparar respuestas de salud pública.</w:t>
+      </w:r>
+      <w:r>
+        <w:t xml:space="preserve"> La integración del sistema combinado T+4 (LightGBM) + supervivencia (Cox PH) permite generar señales de alerta de tres niveles (Alta/Moderada/Baja) actualizables semanalmente con nuevas descargas de GISAID.</w:t>
       </w:r>
     </w:p>
     <w:p>

</xml_diff>

<commit_message>
15/6 antes de reuinión con Brenda y Manuel
</commit_message>
<xml_diff>
--- a/notas_tfm.docx
+++ b/notas_tfm.docx
@@ -14,7 +14,7 @@
         <w:rPr>
           <w:rFonts w:ascii="Times New Roman" w:hAnsi="Times New Roman" w:cs="Times New Roman"/>
         </w:rPr>
-        <w:t>Predicción de la propagación de variantes de SARS-CoV-2 en la población mediante Aprendizaje Automático</w:t>
+        <w:t>Predicción de la expansión de variantes de SARS-CoV-2 en la población mediante Aprendizaje Automático</w:t>
       </w:r>
       <w:proofErr w:type="spellStart"/>
       <w:r>
@@ -190,7 +190,7 @@
         <w:rPr>
           <w:rFonts w:ascii="Times New Roman" w:hAnsi="Times New Roman" w:cs="Times New Roman"/>
         </w:rPr>
-        <w:t>El Modelo 1 alcanza un AUC de 0,8398 (baseline aleatorio: 0,498) usando exclusivamente features de dinámica temporal. El Modelo 2, con features mutacionales within-family, alcanza AUC = 0,8391, prácticamente idéntico al Modelo 1, demostrando que el perfil mutacional real del linaje añade información (+0,009 AUC sobre el modelo solo-temporal) cuando se calcula correctamente. Con threshold óptimo (0,157), el sistema alcanza F1 = 0,40, Precision = 0,38 y Recall = 0,43. El análisis SHAP confirma que las tres features más predictivas son freq_t0 (0,378), slope_8w (0,302) y slope_4w (0,268), validando que la dinámica de momentum es el predictor dominante.</w:t>
+        <w:t>El Modelo 1 alcanza un AUC de 0,8283 (baseline aleatorio: 0,498) usando exclusivamente features de dinámica temporal. El Modelo 2 con mutaciones within-family (M2-30muts) alcanza AUC = 0,8398, superando al Modelo 1 (+0,012 AUC) cuando se aplica early stopping sin fuga al conjunto de test. En términos de Precision-Recall, M2-temporal obtiene AP = 0,476 = 4,02× el azar, la más alta de todos los modelos. Con threshold óptimo, el sistema alcanza F1 = 0,40, Precision = 0,38 y Recall = 0,43. El análisis SHAP confirma que las tres features más predictivas son freq_t0 (0,378), slope_8w (0,302) y slope_4w (0,268), validando que la dinámica de momentum es el predictor dominante. El análisis de supervivencia complementario (Cox PH, C-index = 0,740) extiende el horizonte predictivo a 6 meses, identificando como predictores universales de dominancia la frecuencia y pendiente de crecimiento en el momento de detección, con independencia de la época pandémica.</w:t>
       </w:r>
       <w:proofErr w:type="spellStart"/>
       <w:r>
@@ -268,9 +268,7 @@
           <w:rFonts w:ascii="Times New Roman" w:hAnsi="Times New Roman" w:cs="Times New Roman"/>
         </w:rPr>
       </w:r>
-      <w:r>
-        <w:t xml:space="preserve"> El análisis de supervivencia complementario (Cox PH, C-index = 0,740) extiende el horizonte predictivo a 6 meses, identificando como predictores universales de dominancia la frecuencia y pendiente de crecimiento en el momento de detección, con independencia de la época pandémica.</w:t>
-      </w:r>
+      <w:r/>
     </w:p>
     <w:p>
       <w:pPr>
@@ -5630,23 +5628,21 @@
         <w:rPr>
           <w:rFonts w:ascii="Times New Roman" w:hAnsi="Times New Roman" w:cs="Times New Roman"/>
         </w:rPr>
-        <w:t>Se ha desarrollado un sistema de predicción de variantes emergentes de SARS-CoV-2 que procesa 17,15 millones de secuencias genómicas y construye dos modelos predictivos complementarios. El Modelo 1 (13 features de dinámica temporal, AUC = 0,8398) demuestra que la trayectoria de frecuencia de las últimas 8 semanas es suficiente para identificar linajes emergentes con alta precisión discriminativa. El Modelo 2 (15 temporales + 30 mutacionales within-family, AUC = 0,8391) confirma que el perfil mutacional interno de cada linaje añade valor predictivo (+0,009 AUC) cuando se calcula correctamente, mientras que las frecuencias mutacionales globales perjudican el modelo (−0,019 AUC) al introducir correlaciones temporales espurias. El hallazgo central es que la dinámica de momentum (frecuencia, pendiente, aceleración) es el predictor dominante, y que las mutaciones complementan —sin sustituir— esta señal.</w:t>
-      </w:r>
-      <w:proofErr w:type="spellStart"/>
-      <w:r>
-        <w:rPr>
-          <w:rFonts w:ascii="Times New Roman" w:hAnsi="Times New Roman" w:cs="Times New Roman"/>
-        </w:rPr>
-      </w:r>
-      <w:proofErr w:type="spellEnd"/>
-      <w:r>
-        <w:rPr>
-          <w:rFonts w:ascii="Times New Roman" w:hAnsi="Times New Roman" w:cs="Times New Roman"/>
-        </w:rPr>
-      </w:r>
-      <w:r>
-        <w:t xml:space="preserve"> El sistema se complementa con un modelo de supervivencia (Cox PH) que, aprovechando los 5 años completos de datos pandémicos (2020–2026), estima el tiempo hasta la dominancia global desde la primera detección de cada variante, con un C-index de 0,740.</w:t>
-      </w:r>
+        <w:t>Se ha desarrollado un sistema de predicción de variantes emergentes de SARS-CoV-2 que procesa 17,15 millones de secuencias genómicas y construye dos modelos predictivos complementarios. El Modelo 1 (13 features de dinámica temporal, AUC = 0,8283) demuestra que la trayectoria de frecuencia de las últimas 8 semanas es suficiente para identificar linajes emergentes con alta precisión discriminativa. El Modelo 2 con 30 mutaciones within-family (AUC = 0,8398) confirma que el perfil mutacional interno de cada linaje añade valor predictivo real (+0,012 AUC) cuando se utiliza una metodología sin fuga de información al test set. M2-temporal destaca en Precision-Recall con AP = 0,476 = 4,02× el azar. El hallazgo central es que la dinámica de momentum (frecuencia, pendiente, aceleración) es el predictor dominante, y que las mutaciones complementan esta señal con discriminación adicional en AUC. El sistema se complementa con un modelo de supervivencia (Cox PH) que, aprovechando los 5 años completos de datos pandémicos (2020–2026), estima el tiempo hasta la dominancia global desde la primera detección de cada variante, con un C-index de 0,740.</w:t>
+      </w:r>
+      <w:proofErr w:type="spellStart"/>
+      <w:r>
+        <w:rPr>
+          <w:rFonts w:ascii="Times New Roman" w:hAnsi="Times New Roman" w:cs="Times New Roman"/>
+        </w:rPr>
+      </w:r>
+      <w:proofErr w:type="spellEnd"/>
+      <w:r>
+        <w:rPr>
+          <w:rFonts w:ascii="Times New Roman" w:hAnsi="Times New Roman" w:cs="Times New Roman"/>
+        </w:rPr>
+      </w:r>
+      <w:r/>
     </w:p>
     <w:p>
       <w:pPr>

</xml_diff>